<commit_message>
Changes to be committed: 	modified:   curriculo-latex/curriculo-leonardo-guimaraes.pdf 	deleted:    curriculo-latex/curriculo-leonardo-guimaraes.synctex.gz 	modified:   curriculo-latex/curriculo-leonardo-guimaraes.tex 	modified:   curriculo-leonardo-backend-final.docx 	modified:   curriculo-leonardo-backend.docx 	new file:   curriculo-qa/curriculo-leonardo-backend-final.pdf 	new file:   "docs/Curr\303\255culo Lattes.pdf" 	modified:   public/curriculo-leonardo-backend.pdf 	modified:   src/components/Experience.tsx
</commit_message>
<xml_diff>
--- a/curriculo-leonardo-backend-final.docx
+++ b/curriculo-leonardo-backend-final.docx
@@ -245,16 +245,147 @@
       </w:r>
     </w:p>
     <w:p>
+      <w:pPr/>
+      <w:r>
+        <w:rPr>
+          <w:rFonts w:ascii="Arial" w:hAnsi="Arial"/>
+          <w:b/>
+        </w:rPr>
+        <w:t>Desenvolvedor Backend (GLS / Informática)</w:t>
+      </w:r>
+      <w:r>
+        <w:rPr>
+          <w:rFonts w:ascii="Arial" w:hAnsi="Arial"/>
+          <w:b w:val="0"/>
+        </w:rPr>
+        <w:t xml:space="preserve"> | Instituto Mineiro de Agropecuária (IMA)</w:t>
+      </w:r>
+      <w:r>
+        <w:rPr>
+          <w:rFonts w:ascii="Arial" w:hAnsi="Arial"/>
+          <w:b w:val="0"/>
+        </w:rPr>
+        <w:t xml:space="preserve">  —  jul 2026 — atual</w:t>
+      </w:r>
+    </w:p>
+    <w:p>
       <w:pPr>
-        <w:keepNext/>
-        <w:spacing w:before="80" w:after="40"/>
+        <w:pStyle w:val="ListBullet"/>
       </w:pPr>
       <w:r>
         <w:rPr>
           <w:rFonts w:ascii="Arial" w:hAnsi="Arial"/>
+        </w:rPr>
+        <w:t>Atuação direta como desenvolvedor backend na Gerência de Logística e Serviços Gerais (GLS), sendo responsável pelo desenvolvimento web, evolução e sustentação contínua do sistema Sidagro (migrado do NIM) e de outros projetos corporativos da instituição.</w:t>
+      </w:r>
+    </w:p>
+    <w:p>
+      <w:pPr>
+        <w:pStyle w:val="ListBullet"/>
+      </w:pPr>
+      <w:r>
+        <w:rPr>
+          <w:rFonts w:ascii="Arial" w:hAnsi="Arial"/>
+        </w:rPr>
+        <w:t>Desenvolvimento de APIs RESTful e ferramentas de automação interna para agilizar processos e rotinas operacionais.</w:t>
+      </w:r>
+    </w:p>
+    <w:p>
+      <w:pPr>
+        <w:pStyle w:val="ListBullet"/>
+      </w:pPr>
+      <w:r>
+        <w:rPr>
+          <w:rFonts w:ascii="Arial" w:hAnsi="Arial"/>
+        </w:rPr>
+        <w:t>Modelagem e administração de bancos de dados relacionais para suporte a relatórios gerenciais e controle operacional da instituição.</w:t>
+      </w:r>
+    </w:p>
+    <w:p>
+      <w:pPr>
+        <w:pStyle w:val="ListBullet"/>
+      </w:pPr>
+      <w:r>
+        <w:rPr>
+          <w:rFonts w:ascii="Arial" w:hAnsi="Arial"/>
+        </w:rPr>
+        <w:t>Utilização de Docker e contêineres para padronizar e isolar ambientes de desenvolvimento, homologação e produção.</w:t>
+      </w:r>
+    </w:p>
+    <w:p>
+      <w:pPr/>
+      <w:r>
+        <w:rPr>
+          <w:rFonts w:ascii="Arial" w:hAnsi="Arial"/>
           <w:b/>
-          <w:color w:val="000000"/>
-          <w:sz w:val="22"/>
+        </w:rPr>
+        <w:t>Assistente de Gestão (NIM - Inovação e Modernização)</w:t>
+      </w:r>
+      <w:r>
+        <w:rPr>
+          <w:rFonts w:ascii="Arial" w:hAnsi="Arial"/>
+          <w:b w:val="0"/>
+        </w:rPr>
+        <w:t xml:space="preserve"> | Instituto Mineiro de Agropecuária (IMA)</w:t>
+      </w:r>
+      <w:r>
+        <w:rPr>
+          <w:rFonts w:ascii="Arial" w:hAnsi="Arial"/>
+          <w:b w:val="0"/>
+        </w:rPr>
+        <w:t xml:space="preserve">  —  set 2024 — jul 2026</w:t>
+      </w:r>
+    </w:p>
+    <w:p>
+      <w:pPr>
+        <w:pStyle w:val="ListBullet"/>
+      </w:pPr>
+      <w:r>
+        <w:rPr>
+          <w:rFonts w:ascii="Arial" w:hAnsi="Arial"/>
+        </w:rPr>
+        <w:t>Liderança técnica e atuação ativa no Núcleo de Inovação e Modernização (NIM), com foco na modernização de processos corporativos no setor público.</w:t>
+      </w:r>
+    </w:p>
+    <w:p>
+      <w:pPr>
+        <w:pStyle w:val="ListBullet"/>
+      </w:pPr>
+      <w:r>
+        <w:rPr>
+          <w:rFonts w:ascii="Arial" w:hAnsi="Arial"/>
+        </w:rPr>
+        <w:t>Responsável técnico pelo sistema Sidagro (Sistema de Integração Agropecuária) e pela gestão de projetos de TI estratégicos dentro do NIM.</w:t>
+      </w:r>
+    </w:p>
+    <w:p>
+      <w:pPr>
+        <w:pStyle w:val="ListBullet"/>
+      </w:pPr>
+      <w:r>
+        <w:rPr>
+          <w:rFonts w:ascii="Arial" w:hAnsi="Arial"/>
+        </w:rPr>
+        <w:t>Desenvolvimento e sustentação de soluções digitais essenciais, como plataformas de arrecadação (integração DAE/PIX) e sistemas corporativos de autenticação.</w:t>
+      </w:r>
+    </w:p>
+    <w:p>
+      <w:pPr>
+        <w:pStyle w:val="ListBullet"/>
+      </w:pPr>
+      <w:r>
+        <w:rPr>
+          <w:rFonts w:ascii="Arial" w:hAnsi="Arial"/>
+        </w:rPr>
+        <w:t>Modelagem e documentação de fluxos de processos institucionais complexos utilizando a notação BPMN para integrar e otimizar diferentes setores.</w:t>
+      </w:r>
+    </w:p>
+    <w:p>
+      <w:pPr/>
+      <w:r>
+        <w:rPr>
+          <w:rFonts w:ascii="Arial" w:hAnsi="Arial"/>
+          <w:b/>
         </w:rPr>
         <w:t>Assistente em Gestão de Defesa Agropecuária</w:t>
       </w:r>
@@ -262,29 +393,48 @@
         <w:rPr>
           <w:rFonts w:ascii="Arial" w:hAnsi="Arial"/>
           <w:b w:val="0"/>
-          <w:color w:val="000000"/>
-          <w:sz w:val="22"/>
         </w:rPr>
-        <w:t xml:space="preserve"> | Instituto Mineiro de Agropecuária — NIM</w:t>
+        <w:t xml:space="preserve"> | Instituto Mineiro de Agropecuária — Escritório Seccional de São Francisco</w:t>
       </w:r>
       <w:r>
         <w:rPr>
           <w:rFonts w:ascii="Arial" w:hAnsi="Arial"/>
           <w:b w:val="0"/>
-          <w:color w:val="555555"/>
-          <w:sz w:val="20"/>
         </w:rPr>
-        <w:t xml:space="preserve">  —  nov 2005 – atual</w:t>
+        <w:t xml:space="preserve">  —  nov 2005 — set 2024</w:t>
       </w:r>
     </w:p>
     <w:p>
       <w:pPr>
         <w:pStyle w:val="ListBullet"/>
-        <w:spacing w:after="60" w:line="276" w:lineRule="auto"/>
-        <w:ind w:left="720" w:hanging="360"/>
       </w:pPr>
       <w:r>
-        <w:t>Participação na modernização de processos e em soluções digitais corporativas para arrecadação, autenticação, fluxos BPMN e integração de dados.</w:t>
+        <w:rPr>
+          <w:rFonts w:ascii="Arial" w:hAnsi="Arial"/>
+        </w:rPr>
+        <w:t>Suporte à gestão regional do norte de Minas Gerais, com foco em atendimento ao público, análise processual, fiscalização e emissão de documentos oficiais.</w:t>
+      </w:r>
+    </w:p>
+    <w:p>
+      <w:pPr>
+        <w:pStyle w:val="ListBullet"/>
+      </w:pPr>
+      <w:r>
+        <w:rPr>
+          <w:rFonts w:ascii="Arial" w:hAnsi="Arial"/>
+        </w:rPr>
+        <w:t>Desenvolvimento e manutenção de relatórios automatizados, planilhas gerenciais e pequenos scripts locais para otimização do fluxo de trabalho diário.</w:t>
+      </w:r>
+    </w:p>
+    <w:p>
+      <w:pPr>
+        <w:pStyle w:val="ListBullet"/>
+      </w:pPr>
+      <w:r>
+        <w:rPr>
+          <w:rFonts w:ascii="Arial" w:hAnsi="Arial"/>
+        </w:rPr>
+        <w:t>Emissão de documentos oficiais, controle de trânsito de animais e vegetais e fiscalização de conformidade regulatória regional.</w:t>
       </w:r>
     </w:p>
     <w:p>

</xml_diff>

<commit_message>
Changes to be committed: 	modified:   curriculo-latex/curriculo-leonardo-guimaraes.aux 	new file:   curriculo-latex/curriculo-leonardo-guimaraes.out 	modified:   curriculo-latex/curriculo-leonardo-guimaraes.pdf 	modified:   curriculo-latex/curriculo-leonardo-guimaraes.tex 	modified:   curriculo-leonardo-backend-final.docx 	modified:   curriculo-leonardo-backend.docx 	modified:   curriculo-qa/curriculo-leonardo-backend-final.pdf 	modified:   public/curriculo-leonardo-backend.pdf 	modified:   src/components/Experience.tsx 	modified:   src/components/ProjectsDeveloper.tsx
</commit_message>
<xml_diff>
--- a/curriculo-leonardo-backend-final.docx
+++ b/curriculo-leonardo-backend-final.docx
@@ -251,7 +251,7 @@
           <w:rFonts w:ascii="Arial" w:hAnsi="Arial"/>
           <w:b/>
         </w:rPr>
-        <w:t>Desenvolvedor Backend (GLS / Informática)</w:t>
+        <w:t>Desenvolvedor Backend (GLS / TI)</w:t>
       </w:r>
       <w:r>
         <w:rPr>
@@ -276,7 +276,7 @@
         <w:rPr>
           <w:rFonts w:ascii="Arial" w:hAnsi="Arial"/>
         </w:rPr>
-        <w:t>Atuação direta como desenvolvedor backend na Gerência de Logística e Serviços Gerais (GLS), sendo responsável pelo desenvolvimento web, evolução e sustentação contínua do sistema Sidagro (migrado do NIM) e de outros projetos corporativos da instituição.</w:t>
+        <w:t>Atuação direta como desenvolvedor backend na Gerência de Logística e Serviços Gerais (GLS / TI), sendo responsável pelo desenvolvimento web, evolução e sustentação contínua do sistema Sidagro (https://www.sidagro.ima.mg.gov.br/sidagro/login.seam) (migrado do NIM) e de outros projetos corporativos da instituição.</w:t>
       </w:r>
     </w:p>
     <w:p>
@@ -355,7 +355,7 @@
         <w:rPr>
           <w:rFonts w:ascii="Arial" w:hAnsi="Arial"/>
         </w:rPr>
-        <w:t>Responsável técnico pelo sistema Sidagro (Sistema de Integração Agropecuária) e pela gestão de projetos de TI estratégicos dentro do NIM.</w:t>
+        <w:t>Responsável técnico pelo sistema Sidagro (https://www.sidagro.ima.mg.gov.br/sidagro/login.seam) (Sistema de Integração Agropecuária) e pela gestão de projetos de TI estratégicos dentro do NIM.</w:t>
       </w:r>
     </w:p>
     <w:p>
@@ -435,6 +435,144 @@
           <w:rFonts w:ascii="Arial" w:hAnsi="Arial"/>
         </w:rPr>
         <w:t>Emissão de documentos oficiais, controle de trânsito de animais e vegetais e fiscalização de conformidade regulatória regional.</w:t>
+      </w:r>
+    </w:p>
+    <w:p>
+      <w:pPr/>
+      <w:r>
+        <w:rPr>
+          <w:rFonts w:ascii="Arial" w:hAnsi="Arial"/>
+          <w:b/>
+        </w:rPr>
+        <w:t>Professor Mediador EAD (Desenvolvimento Mobile)</w:t>
+      </w:r>
+      <w:r>
+        <w:rPr>
+          <w:rFonts w:ascii="Arial" w:hAnsi="Arial"/>
+          <w:b w:val="0"/>
+        </w:rPr>
+        <w:t xml:space="preserve"> | IFNMG — Instituto Federal do Norte de Minas Gerais</w:t>
+      </w:r>
+      <w:r>
+        <w:rPr>
+          <w:rFonts w:ascii="Arial" w:hAnsi="Arial"/>
+          <w:b w:val="0"/>
+        </w:rPr>
+        <w:t xml:space="preserve">  —  2020</w:t>
+      </w:r>
+    </w:p>
+    <w:p>
+      <w:pPr>
+        <w:pStyle w:val="ListBullet"/>
+      </w:pPr>
+      <w:r>
+        <w:rPr>
+          <w:rFonts w:ascii="Arial" w:hAnsi="Arial"/>
+        </w:rPr>
+        <w:t>Atuação como Professor Mediador a Distância no curso de Formação Inicial e Continuada (FIC) Programador de Dispositivos Móveis na modalidade EAD.</w:t>
+      </w:r>
+    </w:p>
+    <w:p>
+      <w:pPr>
+        <w:pStyle w:val="ListBullet"/>
+      </w:pPr>
+      <w:r>
+        <w:rPr>
+          <w:rFonts w:ascii="Arial" w:hAnsi="Arial"/>
+        </w:rPr>
+        <w:t>Apoio, orientação e avaliação dos estudantes em tópicos de lógica de programação para dispositivos móveis.</w:t>
+      </w:r>
+    </w:p>
+    <w:p>
+      <w:pPr/>
+      <w:r>
+        <w:rPr>
+          <w:rFonts w:ascii="Arial" w:hAnsi="Arial"/>
+          <w:b/>
+        </w:rPr>
+        <w:t>Professor Mediador Presencial (Tutor de TI)</w:t>
+      </w:r>
+      <w:r>
+        <w:rPr>
+          <w:rFonts w:ascii="Arial" w:hAnsi="Arial"/>
+          <w:b w:val="0"/>
+        </w:rPr>
+        <w:t xml:space="preserve"> | IFNMG — Instituto Federal do Norte de Minas Gerais</w:t>
+      </w:r>
+      <w:r>
+        <w:rPr>
+          <w:rFonts w:ascii="Arial" w:hAnsi="Arial"/>
+          <w:b w:val="0"/>
+        </w:rPr>
+        <w:t xml:space="preserve">  —  2017 — 2019</w:t>
+      </w:r>
+    </w:p>
+    <w:p>
+      <w:pPr>
+        <w:pStyle w:val="ListBullet"/>
+      </w:pPr>
+      <w:r>
+        <w:rPr>
+          <w:rFonts w:ascii="Arial" w:hAnsi="Arial"/>
+        </w:rPr>
+        <w:t>Mediação e tutoria presencial de alunos do curso Técnico em Informática para Internet na modalidade presencial.</w:t>
+      </w:r>
+    </w:p>
+    <w:p>
+      <w:pPr>
+        <w:pStyle w:val="ListBullet"/>
+      </w:pPr>
+      <w:r>
+        <w:rPr>
+          <w:rFonts w:ascii="Arial" w:hAnsi="Arial"/>
+        </w:rPr>
+        <w:t>Suporte didático-pedagógico prático em lógica de programação, banco de dados e desenvolvimento de interfaces web básicas.</w:t>
+      </w:r>
+    </w:p>
+    <w:p>
+      <w:pPr/>
+      <w:r>
+        <w:rPr>
+          <w:rFonts w:ascii="Arial" w:hAnsi="Arial"/>
+          <w:b/>
+        </w:rPr>
+        <w:t>Professor de Ensino Superior</w:t>
+      </w:r>
+      <w:r>
+        <w:rPr>
+          <w:rFonts w:ascii="Arial" w:hAnsi="Arial"/>
+          <w:b w:val="0"/>
+        </w:rPr>
+        <w:t xml:space="preserve"> | FADENORTE — Faculdade de Desenvolvimento do Norte</w:t>
+      </w:r>
+      <w:r>
+        <w:rPr>
+          <w:rFonts w:ascii="Arial" w:hAnsi="Arial"/>
+          <w:b w:val="0"/>
+        </w:rPr>
+        <w:t xml:space="preserve">  —  2019 — 2020</w:t>
+      </w:r>
+    </w:p>
+    <w:p>
+      <w:pPr>
+        <w:pStyle w:val="ListBullet"/>
+      </w:pPr>
+      <w:r>
+        <w:rPr>
+          <w:rFonts w:ascii="Arial" w:hAnsi="Arial"/>
+        </w:rPr>
+        <w:t>Docência de disciplinas de Estatística, Matemática Financeira, Gestão Financeira e Inovação Tecnológica para cursos de graduação e processos gerenciais.</w:t>
+      </w:r>
+    </w:p>
+    <w:p>
+      <w:pPr>
+        <w:pStyle w:val="ListBullet"/>
+      </w:pPr>
+      <w:r>
+        <w:rPr>
+          <w:rFonts w:ascii="Arial" w:hAnsi="Arial"/>
+        </w:rPr>
+        <w:t>Orientação de Projetos Integradores (II, IV e V) focados em aplicação prática e resolução de problemas nas organizações.</w:t>
       </w:r>
     </w:p>
     <w:p>
@@ -573,6 +711,25 @@
       </w:pPr>
       <w:r>
         <w:t>Projetos selecionados</w:t>
+      </w:r>
+    </w:p>
+    <w:p>
+      <w:pPr/>
+      <w:r>
+        <w:rPr>
+          <w:rFonts w:ascii="Arial" w:hAnsi="Arial"/>
+          <w:b/>
+        </w:rPr>
+        <w:t>PORTFÓLIO PROFISSIONAL V3</w:t>
+      </w:r>
+    </w:p>
+    <w:p>
+      <w:pPr/>
+      <w:r>
+        <w:rPr>
+          <w:rFonts w:ascii="Arial" w:hAnsi="Arial"/>
+        </w:rPr>
+        <w:t>Website pessoal responsivo e moderno construído com React, TypeScript e TailwindCSS, apresentando transições suaves, glassmorphism, suporte a temas (dark/light) e download automático de currículos atualizados.</w:t>
       </w:r>
     </w:p>
     <w:p>

</xml_diff>